<commit_message>
Mise à jour Journal de bord, MAJ Manuel_Technique pour la page de garde
</commit_message>
<xml_diff>
--- a/Documentation/Documents/Manuel_technique.docx
+++ b/Documentation/Documents/Manuel_technique.docx
@@ -680,13 +680,15 @@
                                           <w:szCs w:val="36"/>
                                           <w:lang w:val="fr-FR"/>
                                         </w:rPr>
-                                        <w:t>Application de gestion de location de voitures</w:t>
+                                        <w:t>TRAVAIL PRATIQUE INDIVIDUEL (TPI)</w:t>
                                       </w:r>
                                     </w:p>
                                   </w:sdtContent>
                                 </w:sdt>
-                                <w:sdt>
-                                  <w:sdtPr>
+                                <w:p>
+                                  <w:pPr>
+                                    <w:pStyle w:val="Sansinterligne"/>
+                                    <w:spacing w:line="216" w:lineRule="auto"/>
                                     <w:rPr>
                                       <w:rFonts w:asciiTheme="majorHAnsi" w:hAnsiTheme="majorHAnsi" w:cstheme="majorHAnsi"/>
                                       <w:b/>
@@ -696,43 +698,20 @@
                                       <w:szCs w:val="72"/>
                                       <w:lang w:val="fr-FR"/>
                                     </w:rPr>
-                                    <w:alias w:val="Titre"/>
-                                    <w:tag w:val=""/>
-                                    <w:id w:val="-917322602"/>
-                                    <w:dataBinding w:prefixMappings="xmlns:ns0='http://purl.org/dc/elements/1.1/' xmlns:ns1='http://schemas.openxmlformats.org/package/2006/metadata/core-properties' " w:xpath="/ns1:coreProperties[1]/ns0:title[1]" w:storeItemID="{6C3C8BC8-F283-45AE-878A-BAB7291924A1}"/>
-                                    <w15:appearance w15:val="hidden"/>
-                                    <w:text/>
-                                  </w:sdtPr>
-                                  <w:sdtContent>
-                                    <w:p>
-                                      <w:pPr>
-                                        <w:pStyle w:val="Sansinterligne"/>
-                                        <w:spacing w:line="216" w:lineRule="auto"/>
-                                        <w:rPr>
-                                          <w:rFonts w:asciiTheme="majorHAnsi" w:hAnsiTheme="majorHAnsi" w:cstheme="majorHAnsi"/>
-                                          <w:b/>
-                                          <w:caps/>
-                                          <w:color w:val="44546A" w:themeColor="text2"/>
-                                          <w:sz w:val="72"/>
-                                          <w:szCs w:val="72"/>
-                                          <w:lang w:val="fr-FR"/>
-                                        </w:rPr>
-                                      </w:pPr>
-                                      <w:r>
-                                        <w:rPr>
-                                          <w:rFonts w:asciiTheme="majorHAnsi" w:hAnsiTheme="majorHAnsi" w:cstheme="majorHAnsi"/>
-                                          <w:b/>
-                                          <w:caps/>
-                                          <w:color w:val="44546A" w:themeColor="text2"/>
-                                          <w:sz w:val="72"/>
-                                          <w:szCs w:val="72"/>
-                                          <w:lang w:val="fr-FR"/>
-                                        </w:rPr>
-                                        <w:t>Travail de production individuel (TPI)</w:t>
-                                      </w:r>
-                                    </w:p>
-                                  </w:sdtContent>
-                                </w:sdt>
+                                  </w:pPr>
+                                  <w:r>
+                                    <w:rPr>
+                                      <w:rFonts w:asciiTheme="majorHAnsi" w:hAnsiTheme="majorHAnsi" w:cstheme="majorHAnsi"/>
+                                      <w:b/>
+                                      <w:caps/>
+                                      <w:color w:val="44546A" w:themeColor="text2"/>
+                                      <w:sz w:val="72"/>
+                                      <w:szCs w:val="72"/>
+                                      <w:lang w:val="fr-FR"/>
+                                    </w:rPr>
+                                    <w:t>Application de gestion de location de voitures</w:t>
+                                  </w:r>
+                                </w:p>
                               </w:txbxContent>
                             </wps:txbx>
                             <wps:bodyPr rot="0" spcFirstLastPara="0" vertOverflow="overflow" horzOverflow="overflow" vert="horz" wrap="square" lIns="457200" tIns="457200" rIns="0" bIns="0" numCol="1" spcCol="0" rtlCol="0" fromWordArt="0" anchor="b" anchorCtr="0" forceAA="0" compatLnSpc="1">
@@ -763,6 +742,10 @@
                       </v:shape>
                       <v:rect id="Rectangle 75" o:spid="_x0000_s1034" style="position:absolute;width:26426;height:34015;visibility:visible;mso-wrap-style:square;v-text-anchor:middle" o:gfxdata="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" filled="f" stroked="f" strokeweight="1pt"/>
                     </v:group>
+                    <v:shapetype id="_x0000_t202" coordsize="21600,21600" o:spt="202" path="m,l,21600r21600,l21600,xe">
+                      <v:stroke joinstyle="miter"/>
+                      <v:path gradientshapeok="t" o:connecttype="rect"/>
+                    </v:shapetype>
                     <v:shape id="Zone de texte 9" o:spid="_x0000_s1035" type="#_x0000_t202" style="position:absolute;left:7715;top:7620;width:56102;height:25914;visibility:visible;mso-wrap-style:square;v-text-anchor:bottom" o:gfxdata="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" filled="f" stroked="f" strokeweight=".5pt">
                       <v:textbox inset="36pt,36pt,0,0">
                         <w:txbxContent>
@@ -806,13 +789,15 @@
                                     <w:szCs w:val="36"/>
                                     <w:lang w:val="fr-FR"/>
                                   </w:rPr>
-                                  <w:t>Application de gestion de location de voitures</w:t>
+                                  <w:t>TRAVAIL PRATIQUE INDIVIDUEL (TPI)</w:t>
                                 </w:r>
                               </w:p>
                             </w:sdtContent>
                           </w:sdt>
-                          <w:sdt>
-                            <w:sdtPr>
+                          <w:p>
+                            <w:pPr>
+                              <w:pStyle w:val="Sansinterligne"/>
+                              <w:spacing w:line="216" w:lineRule="auto"/>
                               <w:rPr>
                                 <w:rFonts w:asciiTheme="majorHAnsi" w:hAnsiTheme="majorHAnsi" w:cstheme="majorHAnsi"/>
                                 <w:b/>
@@ -822,43 +807,20 @@
                                 <w:szCs w:val="72"/>
                                 <w:lang w:val="fr-FR"/>
                               </w:rPr>
-                              <w:alias w:val="Titre"/>
-                              <w:tag w:val=""/>
-                              <w:id w:val="-917322602"/>
-                              <w:dataBinding w:prefixMappings="xmlns:ns0='http://purl.org/dc/elements/1.1/' xmlns:ns1='http://schemas.openxmlformats.org/package/2006/metadata/core-properties' " w:xpath="/ns1:coreProperties[1]/ns0:title[1]" w:storeItemID="{6C3C8BC8-F283-45AE-878A-BAB7291924A1}"/>
-                              <w15:appearance w15:val="hidden"/>
-                              <w:text/>
-                            </w:sdtPr>
-                            <w:sdtContent>
-                              <w:p>
-                                <w:pPr>
-                                  <w:pStyle w:val="Sansinterligne"/>
-                                  <w:spacing w:line="216" w:lineRule="auto"/>
-                                  <w:rPr>
-                                    <w:rFonts w:asciiTheme="majorHAnsi" w:hAnsiTheme="majorHAnsi" w:cstheme="majorHAnsi"/>
-                                    <w:b/>
-                                    <w:caps/>
-                                    <w:color w:val="44546A" w:themeColor="text2"/>
-                                    <w:sz w:val="72"/>
-                                    <w:szCs w:val="72"/>
-                                    <w:lang w:val="fr-FR"/>
-                                  </w:rPr>
-                                </w:pPr>
-                                <w:r>
-                                  <w:rPr>
-                                    <w:rFonts w:asciiTheme="majorHAnsi" w:hAnsiTheme="majorHAnsi" w:cstheme="majorHAnsi"/>
-                                    <w:b/>
-                                    <w:caps/>
-                                    <w:color w:val="44546A" w:themeColor="text2"/>
-                                    <w:sz w:val="72"/>
-                                    <w:szCs w:val="72"/>
-                                    <w:lang w:val="fr-FR"/>
-                                  </w:rPr>
-                                  <w:t>Travail de production individuel (TPI)</w:t>
-                                </w:r>
-                              </w:p>
-                            </w:sdtContent>
-                          </w:sdt>
+                            </w:pPr>
+                            <w:r>
+                              <w:rPr>
+                                <w:rFonts w:asciiTheme="majorHAnsi" w:hAnsiTheme="majorHAnsi" w:cstheme="majorHAnsi"/>
+                                <w:b/>
+                                <w:caps/>
+                                <w:color w:val="44546A" w:themeColor="text2"/>
+                                <w:sz w:val="72"/>
+                                <w:szCs w:val="72"/>
+                                <w:lang w:val="fr-FR"/>
+                              </w:rPr>
+                              <w:t>Application de gestion de location de voitures</w:t>
+                            </w:r>
+                          </w:p>
                         </w:txbxContent>
                       </v:textbox>
                     </v:shape>
@@ -7423,16 +7385,7 @@
         <w:sz w:val="26"/>
         <w:szCs w:val="26"/>
       </w:rPr>
-      <w:t>Leonel Borges Pereira</w:t>
-    </w:r>
-    <w:r>
-      <w:rPr>
-        <w:rFonts w:asciiTheme="majorHAnsi" w:hAnsiTheme="majorHAnsi" w:cstheme="majorHAnsi"/>
-        <w:color w:val="44546A" w:themeColor="text2"/>
-        <w:sz w:val="26"/>
-        <w:szCs w:val="26"/>
-      </w:rPr>
-      <w:t xml:space="preserve"> </w:t>
+      <w:t xml:space="preserve">Leonel Borges Pereira </w:t>
     </w:r>
     <w:r>
       <w:rPr>
@@ -7496,7 +7449,7 @@
         <w:sz w:val="26"/>
         <w:szCs w:val="26"/>
       </w:rPr>
-      <w:t>2 mai 2023</w:t>
+      <w:t>8 mai 2023</w:t>
     </w:r>
     <w:r>
       <w:rPr>
@@ -9267,7 +9220,6 @@
   <w:style w:type="character" w:default="1" w:styleId="Policepardfaut">
     <w:name w:val="Default Paragraph Font"/>
     <w:uiPriority w:val="1"/>
-    <w:semiHidden/>
     <w:unhideWhenUsed/>
   </w:style>
   <w:style w:type="table" w:default="1" w:styleId="TableauNormal">

</xml_diff>